<commit_message>
Summary: drop the reproducibility bullet, say absolute level and relative ranking
Removes the reproducibility bullet from "What the analysis does".

Replaces the height and shape metaphors with the plain terms throughout. A map
now gets the relative ranking of districts right or wrong, and sits at the right
or wrong absolute level. Nine passages changed, including the second conclusion,
which becomes "The obstacle is absolute level, not relative ranking".

The metric guide follows the same terms: Pearson r measures the relative
ranking and is unchanged by a constant shift, so it says nothing about absolute
level; RMSE absorbs both; level bias isolates the absolute level.

Co-Authored-By: Claude Opus 5 <noreply@anthropic.com>
</commit_message>
<xml_diff>
--- a/docs/PROJECT_SUMMARY.docx
+++ b/docs/PROJECT_SUMMARY.docx
@@ -304,52 +304,6 @@
         <w:t xml:space="preserve">compares prevalences and not definitions.</w:t>
       </w:r>
     </w:p>
-    <w:p>
-      <w:pPr>
-        <w:pStyle w:val="Compact"/>
-        <w:numPr>
-          <w:ilvl w:val="0"/>
-          <w:numId w:val="1001"/>
-        </w:numPr>
-      </w:pPr>
-      <w:r>
-        <w:rPr>
-          <w:b/>
-          <w:bCs/>
-        </w:rPr>
-        <w:t xml:space="preserve">Reproducibility.</w:t>
-      </w:r>
-      <w:r>
-        <w:t xml:space="preserve"> </w:t>
-      </w:r>
-      <w:r>
-        <w:t xml:space="preserve">Frozen baseline tables with an md5 manifest, a regression</w:t>
-      </w:r>
-      <w:r>
-        <w:t xml:space="preserve"> </w:t>
-      </w:r>
-      <w:r>
-        <w:t xml:space="preserve">gate that classifies every table as unchanged, new scheme rows or a changed</w:t>
-      </w:r>
-      <w:r>
-        <w:t xml:space="preserve"> </w:t>
-      </w:r>
-      <w:r>
-        <w:t xml:space="preserve">baseline, an assay-lineage gate that halts the pipeline when a modelled</w:t>
-      </w:r>
-      <w:r>
-        <w:t xml:space="preserve"> </w:t>
-      </w:r>
-      <w:r>
-        <w:t xml:space="preserve">outcome has no recorded measurement provenance, and md5 stamps on untracked</w:t>
-      </w:r>
-      <w:r>
-        <w:t xml:space="preserve"> </w:t>
-      </w:r>
-      <w:r>
-        <w:t xml:space="preserve">file inputs.</w:t>
-      </w:r>
-    </w:p>
     <w:bookmarkEnd w:id="9"/>
     <w:bookmarkStart w:id="19" w:name="findings"/>
     <w:p>
@@ -550,7 +504,7 @@
         <w:t xml:space="preserve"> </w:t>
       </w:r>
       <w:r>
-        <w:t xml:space="preserve">asks whether the map gets the</w:t>
+        <w:t xml:space="preserve">measures the</w:t>
       </w:r>
       <w:r>
         <w:t xml:space="preserve"> </w:t>
@@ -560,25 +514,22 @@
           <w:i/>
           <w:iCs/>
         </w:rPr>
-        <w:t xml:space="preserve">shape</w:t>
-      </w:r>
-      <w:r>
-        <w:t xml:space="preserve"> </w:t>
-      </w:r>
-      <w:r>
-        <w:t xml:space="preserve">right, meaning whether it</w:t>
-      </w:r>
-      <w:r>
-        <w:t xml:space="preserve"> </w:t>
-      </w:r>
-      <w:r>
-        <w:t xml:space="preserve">ranks districts correctly. Correlation is unchanged by a constant shift, so it</w:t>
-      </w:r>
-      <w:r>
-        <w:t xml:space="preserve"> </w:t>
-      </w:r>
-      <w:r>
-        <w:t xml:space="preserve">says nothing about level.</w:t>
+        <w:t xml:space="preserve">relative ranking</w:t>
+      </w:r>
+      <w:r>
+        <w:t xml:space="preserve">: whether the map puts districts</w:t>
+      </w:r>
+      <w:r>
+        <w:t xml:space="preserve"> </w:t>
+      </w:r>
+      <w:r>
+        <w:t xml:space="preserve">in the right order. Correlation is unchanged by a constant shift, so it says</w:t>
+      </w:r>
+      <w:r>
+        <w:t xml:space="preserve"> </w:t>
+      </w:r>
+      <w:r>
+        <w:t xml:space="preserve">nothing about the absolute level.</w:t>
       </w:r>
     </w:p>
     <w:p>
@@ -674,19 +625,25 @@
         <w:t xml:space="preserve"> </w:t>
       </w:r>
       <w:r>
-        <w:t xml:space="preserve">RMSE is total error and absorbs both a wrong shape and a wrong height. Level</w:t>
-      </w:r>
-      <w:r>
-        <w:t xml:space="preserve"> </w:t>
-      </w:r>
-      <w:r>
-        <w:t xml:space="preserve">bias isolates the height. A model with modest RMSE and large level bias has the</w:t>
-      </w:r>
-      <w:r>
-        <w:t xml:space="preserve"> </w:t>
-      </w:r>
-      <w:r>
-        <w:t xml:space="preserve">pattern roughly right and sits at the wrong altitude.</w:t>
+        <w:t xml:space="preserve">RMSE is total error and absorbs both a wrong ranking and a wrong absolute</w:t>
+      </w:r>
+      <w:r>
+        <w:t xml:space="preserve"> </w:t>
+      </w:r>
+      <w:r>
+        <w:t xml:space="preserve">level. Level bias isolates the absolute level. A model with modest RMSE and</w:t>
+      </w:r>
+      <w:r>
+        <w:t xml:space="preserve"> </w:t>
+      </w:r>
+      <w:r>
+        <w:t xml:space="preserve">large level bias ranks districts about right and places all of them too high or</w:t>
+      </w:r>
+      <w:r>
+        <w:t xml:space="preserve"> </w:t>
+      </w:r>
+      <w:r>
+        <w:t xml:space="preserve">too low.</w:t>
       </w:r>
     </w:p>
     <w:tbl>
@@ -1600,19 +1557,25 @@
         <w:t xml:space="preserve"> </w:t>
       </w:r>
       <w:r>
-        <w:t xml:space="preserve">and spread from the target and leaves the model fitting shape alone. That is why</w:t>
-      </w:r>
-      <w:r>
-        <w:t xml:space="preserve"> </w:t>
-      </w:r>
-      <w:r>
-        <w:t xml:space="preserve">they lead on Pearson r while their level bias stays ordinary. They are a useful</w:t>
-      </w:r>
-      <w:r>
-        <w:t xml:space="preserve"> </w:t>
-      </w:r>
-      <w:r>
-        <w:t xml:space="preserve">upper bound on how much pattern is learnable, not a deployable recipe.</w:t>
+        <w:t xml:space="preserve">and spread from the target and leaves the model fitting relative rankings alone.</w:t>
+      </w:r>
+      <w:r>
+        <w:t xml:space="preserve"> </w:t>
+      </w:r>
+      <w:r>
+        <w:t xml:space="preserve">That is why they lead on Pearson r while their level bias stays ordinary. They</w:t>
+      </w:r>
+      <w:r>
+        <w:t xml:space="preserve"> </w:t>
+      </w:r>
+      <w:r>
+        <w:t xml:space="preserve">bound how much of the relative ranking is learnable, and they are not a</w:t>
+      </w:r>
+      <w:r>
+        <w:t xml:space="preserve"> </w:t>
+      </w:r>
+      <w:r>
+        <w:t xml:space="preserve">deployable recipe.</w:t>
       </w:r>
     </w:p>
     <w:p>
@@ -1914,7 +1877,7 @@
         <w:t xml:space="preserve"> </w:t>
       </w:r>
       <w:r>
-        <w:t xml:space="preserve">at the right height.</w:t>
+        <w:t xml:space="preserve">at the right absolute level.</w:t>
       </w:r>
     </w:p>
     <w:bookmarkEnd w:id="10"/>
@@ -1976,7 +1939,7 @@
         <w:t xml:space="preserve"> </w:t>
       </w:r>
       <w:r>
-        <w:t xml:space="preserve">It does sharpen the transported spatial pattern: child iron Pearson rises from</w:t>
+        <w:t xml:space="preserve">It does sharpen the transported relative rankings: child iron Pearson rises from</w:t>
       </w:r>
       <w:r>
         <w:t xml:space="preserve"> </w:t>
@@ -1996,7 +1959,13 @@
         <w:pStyle w:val="BodyText"/>
       </w:pPr>
       <w:r>
-        <w:t xml:space="preserve">Harmonizing measurement buys pattern. It does not buy level.</w:t>
+        <w:t xml:space="preserve">Harmonizing measurement improves the relative rankings. It does not correct the</w:t>
+      </w:r>
+      <w:r>
+        <w:t xml:space="preserve"> </w:t>
+      </w:r>
+      <w:r>
+        <w:t xml:space="preserve">absolute level.</w:t>
       </w:r>
     </w:p>
     <w:bookmarkEnd w:id="11"/>
@@ -2020,25 +1989,25 @@
         <w:t xml:space="preserve"> </w:t>
       </w:r>
       <w:r>
-        <w:t xml:space="preserve">height of a transported map. One constant shift on the logit scale makes the</w:t>
-      </w:r>
-      <w:r>
-        <w:t xml:space="preserve"> </w:t>
-      </w:r>
-      <w:r>
-        <w:t xml:space="preserve">map's weighted aggregate equal the anchor. The shift is monotone, so district</w:t>
-      </w:r>
-      <w:r>
-        <w:t xml:space="preserve"> </w:t>
-      </w:r>
-      <w:r>
-        <w:t xml:space="preserve">ranking survives untouched: it moves level without inventing spatial signal. It</w:t>
-      </w:r>
-      <w:r>
-        <w:t xml:space="preserve"> </w:t>
-      </w:r>
-      <w:r>
-        <w:t xml:space="preserve">attacks precisely the error term above.</w:t>
+        <w:t xml:space="preserve">absolute level of a transported map. One constant shift on the logit scale makes</w:t>
+      </w:r>
+      <w:r>
+        <w:t xml:space="preserve"> </w:t>
+      </w:r>
+      <w:r>
+        <w:t xml:space="preserve">the map's weighted aggregate equal the anchor. The shift is monotone, so the</w:t>
+      </w:r>
+      <w:r>
+        <w:t xml:space="preserve"> </w:t>
+      </w:r>
+      <w:r>
+        <w:t xml:space="preserve">relative ranking of districts survives untouched: it corrects the absolute level</w:t>
+      </w:r>
+      <w:r>
+        <w:t xml:space="preserve"> </w:t>
+      </w:r>
+      <w:r>
+        <w:t xml:space="preserve">without inventing spatial signal. It attacks precisely the error term above.</w:t>
       </w:r>
     </w:p>
     <w:tbl>
@@ -2860,7 +2829,7 @@
         <w:t xml:space="preserve"> </w:t>
       </w:r>
       <w:r>
-        <w:t xml:space="preserve">height, and leaves the typical fold alone. A location-only correction should do</w:t>
+        <w:t xml:space="preserve">absolute level, and leaves the typical fold alone. A location-only correction should do</w:t>
       </w:r>
       <w:r>
         <w:t xml:space="preserve"> </w:t>
@@ -2935,25 +2904,31 @@
           <w:b/>
           <w:bCs/>
         </w:rPr>
-        <w:t xml:space="preserve">The obstacle is height, not shape.</w:t>
-      </w:r>
-      <w:r>
-        <w:t xml:space="preserve"> </w:t>
-      </w:r>
-      <w:r>
-        <w:t xml:space="preserve">The transported map has roughly the</w:t>
-      </w:r>
-      <w:r>
-        <w:t xml:space="preserve"> </w:t>
-      </w:r>
-      <w:r>
-        <w:t xml:space="preserve">right pattern and the wrong level, and that level is a country intercept no</w:t>
-      </w:r>
-      <w:r>
-        <w:t xml:space="preserve"> </w:t>
-      </w:r>
-      <w:r>
-        <w:t xml:space="preserve">covariate in this pool supplies.</w:t>
+        <w:t xml:space="preserve">The obstacle is absolute level, not relative ranking.</w:t>
+      </w:r>
+      <w:r>
+        <w:t xml:space="preserve"> </w:t>
+      </w:r>
+      <w:r>
+        <w:t xml:space="preserve">The transported map</w:t>
+      </w:r>
+      <w:r>
+        <w:t xml:space="preserve"> </w:t>
+      </w:r>
+      <w:r>
+        <w:t xml:space="preserve">ranks districts roughly correctly and places all of them at the wrong</w:t>
+      </w:r>
+      <w:r>
+        <w:t xml:space="preserve"> </w:t>
+      </w:r>
+      <w:r>
+        <w:t xml:space="preserve">absolute level, which is a country intercept no covariate in this pool</w:t>
+      </w:r>
+      <w:r>
+        <w:t xml:space="preserve"> </w:t>
+      </w:r>
+      <w:r>
+        <w:t xml:space="preserve">supplies.</w:t>
       </w:r>
     </w:p>
     <w:p>
@@ -3161,7 +3136,7 @@
         <w:t xml:space="preserve"> </w:t>
       </w:r>
       <w:r>
-        <w:t xml:space="preserve">available. It converts a correctly shaped map into a usable one, it costs a</w:t>
+        <w:t xml:space="preserve">available. It converts a correctly ranked map into a usable one, it costs a</w:t>
       </w:r>
       <w:r>
         <w:t xml:space="preserve"> </w:t>

</xml_diff>

<commit_message>
Summary: name the prescreen-then-stepwise search and show both arms
The individual-level table reported only the nested numbers, which made the
procedure behind them unrecognisable. It now names the three-step search over
roughly 590 candidates, lists the five variables it settles on, and puts the
two arms side by side: 0.5977 against 0.5214 under the SuperLearner, 0.6199
against 0.5380 under the glm.

States plainly that the five variables are not at fault. The search ranked
candidates on the folds it was later scored on, so the apparent transport
signal is a property of the search.

Co-Authored-By: Claude Opus 5 <noreply@anthropic.com>
</commit_message>
<xml_diff>
--- a/docs/PROJECT_SUMMARY.docx
+++ b/docs/PROJECT_SUMMARY.docx
@@ -338,13 +338,69 @@
         <w:t xml:space="preserve"> </w:t>
       </w:r>
       <w:r>
-        <w:t xml:space="preserve">Selection reruns inside each fold, so it sees only the</w:t>
-      </w:r>
-      <w:r>
-        <w:t xml:space="preserve"> </w:t>
-      </w:r>
-      <w:r>
-        <w:t xml:space="preserve">training countries. Over 16 folds:</w:t>
+        <w:t xml:space="preserve">The production predictor set comes from a three-step search</w:t>
+      </w:r>
+      <w:r>
+        <w:t xml:space="preserve"> </w:t>
+      </w:r>
+      <w:r>
+        <w:t xml:space="preserve">over roughly 590 pooled candidates: rank each candidate by its own cross-country</w:t>
+      </w:r>
+      <w:r>
+        <w:t xml:space="preserve"> </w:t>
+      </w:r>
+      <w:r>
+        <w:t xml:space="preserve">transport strength, collapse near-duplicate variants of the same construct, then</w:t>
+      </w:r>
+      <w:r>
+        <w:t xml:space="preserve"> </w:t>
+      </w:r>
+      <w:r>
+        <w:t xml:space="preserve">add predictors greedily for as long as leave-one-country-out AUC improves. It</w:t>
+      </w:r>
+      <w:r>
+        <w:t xml:space="preserve"> </w:t>
+      </w:r>
+      <w:r>
+        <w:t xml:space="preserve">settles on five variables: soil calcium variability, November rainfall, malaria</w:t>
+      </w:r>
+      <w:r>
+        <w:t xml:space="preserve"> </w:t>
+      </w:r>
+      <w:r>
+        <w:t xml:space="preserve">incidence, a vegetation principal component, and MAP parasite rate. A small,</w:t>
+      </w:r>
+      <w:r>
+        <w:t xml:space="preserve"> </w:t>
+      </w:r>
+      <w:r>
+        <w:t xml:space="preserve">interpretable set of that kind is the natural thing to report.</w:t>
+      </w:r>
+    </w:p>
+    <w:p>
+      <w:pPr>
+        <w:pStyle w:val="BodyText"/>
+      </w:pPr>
+      <w:r>
+        <w:t xml:space="preserve">Scoring it on the same folds the search consulted gives the first column below.</w:t>
+      </w:r>
+      <w:r>
+        <w:t xml:space="preserve"> </w:t>
+      </w:r>
+      <w:r>
+        <w:t xml:space="preserve">Rerunning the entire search inside each fold, so it sees only the three training</w:t>
+      </w:r>
+      <w:r>
+        <w:t xml:space="preserve"> </w:t>
+      </w:r>
+      <w:r>
+        <w:t xml:space="preserve">countries, gives the second. Both columns use the same estimator on the same 16</w:t>
+      </w:r>
+      <w:r>
+        <w:t xml:space="preserve"> </w:t>
+      </w:r>
+      <w:r>
+        <w:t xml:space="preserve">folds, so the gap between them is the search, not the model.</w:t>
       </w:r>
     </w:p>
     <w:tbl>
@@ -354,8 +410,9 @@
         <w:tblLook w:firstRow="1" w:lastRow="0" w:firstColumn="0" w:lastColumn="0" w:noHBand="0" w:noVBand="0" w:val="0020"/>
       </w:tblPr>
       <w:tblGrid>
-        <w:gridCol w:w="3960"/>
-        <w:gridCol w:w="3960"/>
+        <w:gridCol w:w="2640"/>
+        <w:gridCol w:w="2640"/>
+        <w:gridCol w:w="2640"/>
       </w:tblGrid>
       <w:tr>
         <w:trPr>
@@ -379,7 +436,18 @@
               <w:pStyle w:val="Compact"/>
             </w:pPr>
             <w:r>
-              <w:t xml:space="preserve">Mean LOCO AUC</w:t>
+              <w:t xml:space="preserve">Search sees every fold</w:t>
+            </w:r>
+          </w:p>
+        </w:tc>
+        <w:tc>
+          <w:tcPr/>
+          <w:p>
+            <w:pPr>
+              <w:pStyle w:val="Compact"/>
+            </w:pPr>
+            <w:r>
+              <w:t xml:space="preserve">Search nested in the fold</w:t>
             </w:r>
           </w:p>
         </w:tc>
@@ -403,6 +471,17 @@
               <w:pStyle w:val="Compact"/>
             </w:pPr>
             <w:r>
+              <w:t xml:space="preserve">0.5977</w:t>
+            </w:r>
+          </w:p>
+        </w:tc>
+        <w:tc>
+          <w:tcPr/>
+          <w:p>
+            <w:pPr>
+              <w:pStyle w:val="Compact"/>
+            </w:pPr>
+            <w:r>
               <w:t xml:space="preserve">0.5214</w:t>
             </w:r>
           </w:p>
@@ -427,6 +506,17 @@
               <w:pStyle w:val="Compact"/>
             </w:pPr>
             <w:r>
+              <w:t xml:space="preserve">0.6199</w:t>
+            </w:r>
+          </w:p>
+        </w:tc>
+        <w:tc>
+          <w:tcPr/>
+          <w:p>
+            <w:pPr>
+              <w:pStyle w:val="Compact"/>
+            </w:pPr>
+            <w:r>
               <w:t xml:space="preserve">0.5380</w:t>
             </w:r>
           </w:p>
@@ -438,7 +528,45 @@
         <w:pStyle w:val="BodyText"/>
       </w:pPr>
       <w:r>
-        <w:t xml:space="preserve">Four of the 16 SuperLearner folds fall below 0.5.</w:t>
+        <w:t xml:space="preserve">Nesting the search costs about 0.08 AUC and it costs it almost everywhere:</w:t>
+      </w:r>
+      <w:r>
+        <w:t xml:space="preserve"> </w:t>
+      </w:r>
+      <w:r>
+        <w:t xml:space="preserve">the nested arm is worse in 15 of the 16 folds under either scorer, and four of</w:t>
+      </w:r>
+      <w:r>
+        <w:t xml:space="preserve"> </w:t>
+      </w:r>
+      <w:r>
+        <w:t xml:space="preserve">its SuperLearner folds fall below 0.5.</w:t>
+      </w:r>
+    </w:p>
+    <w:p>
+      <w:pPr>
+        <w:pStyle w:val="BodyText"/>
+      </w:pPr>
+      <w:r>
+        <w:t xml:space="preserve">The five variables are not the problem. The search that found them ranked</w:t>
+      </w:r>
+      <w:r>
+        <w:t xml:space="preserve"> </w:t>
+      </w:r>
+      <w:r>
+        <w:t xml:space="preserve">candidates on the same folds it was later scored on, so most of the apparent</w:t>
+      </w:r>
+      <w:r>
+        <w:t xml:space="preserve"> </w:t>
+      </w:r>
+      <w:r>
+        <w:t xml:space="preserve">transport signal is a property of the search rather than of the predictors. Any</w:t>
+      </w:r>
+      <w:r>
+        <w:t xml:space="preserve"> </w:t>
+      </w:r>
+      <w:r>
+        <w:t xml:space="preserve">selection procedure run this way will produce a set that looks transportable.</w:t>
       </w:r>
     </w:p>
     <w:p>

</xml_diff>

<commit_message>
Rename the reliability ceiling to the noise ceiling in prose
r_max is the correlation a perfect model could reach against a noisy
survey estimate. "Noise ceiling" is the name this quantity carries in the
encoding-model literature, so reviewers will recognise it; "reliability
ceiling" was the project's own coinage.

Prose only. The `reliability` and `r_max` / `r_share` identifiers in
R/area_reliability.R and in the result tables are unchanged, because five
committed tables under results/tables/ and the frozen_2026-08 baselines
carry those column names and the regression gate compares against them.
The naming is recorded in the header of R/area_reliability.R.

docs/manuscript_mcn.qmd and docs/mn_prediction_slides.* also use the old
term but carry another session's uncommitted edits, so they are untouched.

Co-Authored-By: Claude Opus 5 <noreply@anthropic.com>
</commit_message>
<xml_diff>
--- a/docs/PROJECT_SUMMARY.docx
+++ b/docs/PROJECT_SUMMARY.docx
@@ -227,7 +227,7 @@
         <w:t xml:space="preserve"> </w:t>
       </w:r>
       <w:r>
-        <w:t xml:space="preserve">and design-based intervals, out-of-support trust flags, and a reliability</w:t>
+        <w:t xml:space="preserve">and design-based intervals, out-of-support trust flags, and a noise</w:t>
       </w:r>
       <w:r>
         <w:t xml:space="preserve"> </w:t>
@@ -679,7 +679,7 @@
         <w:t xml:space="preserve"> </w:t>
       </w:r>
       <w:r>
-        <w:t xml:space="preserve">rescales that correlation by the reliability ceiling, the</w:t>
+        <w:t xml:space="preserve">rescales that correlation by the noise ceiling, the</w:t>
       </w:r>
       <w:r>
         <w:t xml:space="preserve"> </w:t>
@@ -2645,7 +2645,7 @@
         <w:pStyle w:val="FirstParagraph"/>
       </w:pPr>
       <w:r>
-        <w:t xml:space="preserve">The reliability ceiling falls as the unit gets finer: 0.59 at Admin-1, 0.31 at</w:t>
+        <w:t xml:space="preserve">The noise ceiling falls as the unit gets finer: 0.59 at Admin-1, 0.31 at</w:t>
       </w:r>
       <w:r>
         <w:t xml:space="preserve"> </w:t>
@@ -3617,7 +3617,7 @@
         <w:t xml:space="preserve"> </w:t>
       </w:r>
       <w:r>
-        <w:t xml:space="preserve">The reliability ceiling nearly</w:t>
+        <w:t xml:space="preserve">The noise ceiling nearly</w:t>
       </w:r>
       <w:r>
         <w:t xml:space="preserve"> </w:t>

</xml_diff>